<commit_message>
Pedir RFC al aceptar cotización y guardarlo para alta de cliente
- Nuevo marcador {{RFC}} y {{NUMERO_ESPACIO}} en las 8 plantillas
  reales (antes quedaban en blanco como "COLOCAR RFC"/"Oficina 0").
- /cotizaciones: el botón "Aceptar" ahora pide el RFC del cliente
  antes de generar el contrato.
- cotizacion-aceptar: resuelve el número de oficina/espacio ya
  asignado (oficinas.numero, sin volver a preguntarlo) y guarda el
  RFC en contratos.rfc (migracion_contratos_rfc.sql).
- alta-cliente: cuando se selecciona un contrato pendiente, precarga
  RFC y razón social (ya capturados al aceptar/cotizar) en el
  formulario de alta, en vez de pedirlos de nuevo — quedan en
  profiles.rfc/empresa al crear la cuenta, vía /api/crear-cliente.

Co-Authored-By: Claude Sonnet 5 <noreply@anthropic.com>
</commit_message>
<xml_diff>
--- a/public/plantillas-contrato/BosquesCoworking30hrsFisica.docx
+++ b/public/plantillas-contrato/BosquesCoworking30hrsFisica.docx
@@ -528,7 +528,7 @@
           <w:highlight w:val="yellow"/>
           <w:rtl w:val="0"/>
         </w:rPr>
-        <w:t xml:space="preserve">“Coworking (LETRA)”</w:t>
+        <w:t xml:space="preserve">“Coworking {{NUMERO_ESPACIO}}”</w:t>
       </w:r>
       <w:r>
         <w:rPr>
@@ -887,7 +887,7 @@
           <w:highlight w:val="yellow"/>
           <w:rtl w:val="0"/>
         </w:rPr>
-        <w:t xml:space="preserve">COLOCAR RFC</w:t>
+        <w:t xml:space="preserve">{{RFC}}</w:t>
       </w:r>
       <w:r>
         <w:rPr>

</xml_diff>